<commit_message>
fix agent and gui
</commit_message>
<xml_diff>
--- a/docs/SAINT_Documentation.docx
+++ b/docs/SAINT_Documentation.docx
@@ -8352,7 +8352,7 @@
         <w:br/>
         <w:t>├── config/ (loader, defaults, validator, crypto)</w:t>
         <w:br/>
-        <w:t>├── services/ (heartbeat, windows_service)</w:t>
+        <w:t>├── services/ (heartbeat only)</w:t>
         <w:br/>
         <w:t>├── logging_module/sender.py  # LogSender (batch 100, 2s interval)</w:t>
         <w:br/>
@@ -11447,6 +11447,72 @@
           </w:p>
         </w:tc>
       </w:tr>
+      <w:tr>
+        <w:tc>
+          <w:tcPr>
+            <w:tcW w:type="dxa" w:w="4320"/>
+          </w:tcPr>
+          <w:p>
+            <w:r>
+              <w:t>Self-allow program rule</w:t>
+            </w:r>
+          </w:p>
+        </w:tc>
+        <w:tc>
+          <w:tcPr>
+            <w:tcW w:type="dxa" w:w="4320"/>
+          </w:tcPr>
+          <w:p>
+            <w:r>
+              <w:t>Allow rule cho exe agent (program=SAINT.exe, TCP 443 + UDP/TCP 53). Bền vững với DNS rotation/CDN; bypass IP-based whitelist khi server đổi IP.</w:t>
+            </w:r>
+          </w:p>
+        </w:tc>
+      </w:tr>
+      <w:tr>
+        <w:tc>
+          <w:tcPr>
+            <w:tcW w:type="dxa" w:w="4320"/>
+          </w:tcPr>
+          <w:p>
+            <w:r>
+              <w:t>IPv4-only enforcement</w:t>
+            </w:r>
+          </w:p>
+        </w:tc>
+        <w:tc>
+          <w:tcPr>
+            <w:tcW w:type="dxa" w:w="4320"/>
+          </w:tcPr>
+          <w:p>
+            <w:r>
+              <w:t>Firewall rules và essential_ips chỉ áp dụng IPv4 do hạn chế của netsh advfirewall với IPv6 (stderr trống khi fail).</w:t>
+            </w:r>
+          </w:p>
+        </w:tc>
+      </w:tr>
+      <w:tr>
+        <w:tc>
+          <w:tcPr>
+            <w:tcW w:type="dxa" w:w="4320"/>
+          </w:tcPr>
+          <w:p>
+            <w:r>
+              <w:t>Compliance Detection 4-level</w:t>
+            </w:r>
+          </w:p>
+        </w:tc>
+        <w:tc>
+          <w:tcPr>
+            <w:tcW w:type="dxa" w:w="4320"/>
+          </w:tcPr>
+          <w:p>
+            <w:r>
+              <w:t>Phân loại log thành ALLOWED / ALLOWED_BY_IP / BLOCKED / OBSERVED. ALLOWED_BY_IP (level WARNING) phát hiện CDN bleed-through để admin review.</w:t>
+            </w:r>
+          </w:p>
+        </w:tc>
+      </w:tr>
     </w:tbl>
     <w:p/>
     <w:p>
@@ -12052,6 +12118,44 @@
     <w:p>
       <w:r>
         <w:br w:type="page"/>
+      </w:r>
+    </w:p>
+    <w:p>
+      <w:pPr/>
+      <w:r>
+        <w:t>Hạn chế đã biết (limitations): CDN shared IP có thể che giấu nhiều domain dưới cùng 1 IP, đặc biệt với Cloudflare và Akamai. HTTP/2 connection coalescing có thể reuse TLS connection cho nhiều domain mà không tạo ClientHello mới. ECH (Encrypted ClientHello) trong TLS 1.3 mã hóa SNI nên sniffer không trích xuất được. QUIC/HTTP/3 (UDP 443) mã hóa từ byte đầu nên không inspect được — giải pháp hiện tại là block UDP 443 để force fallback xuống TCP 443. Các hạn chế này được document đầy đủ cho future work (xem Chương 6).</w:t>
+      </w:r>
+    </w:p>
+    <w:p>
+      <w:pPr/>
+      <w:r>
+        <w:t>Triết lý thiết kế — không có hành vi malware-like: Các kỹ thuật active enforcement ở Layer 7 (TCP RST injection, DNS sinkhole hijack, browser policy modification qua registry để disable DoH/ECH) đều bị Defender, CrowdStrike, SentinelOne flag là malicious behavior bởi behavioral detection. SAINT chấp nhận giới hạn fine-grained enforcement ở Layer 7, bù lại bằng detective control — admin có visibility qua dashboard (ALLOWED_BY_IP metric) và iterate policy. Đây là pattern phổ biến của enterprise security: prevent what you can, detect what you can't. Đặc biệt phù hợp deploy chung với EDR ở môi trường giáo dục/enterprise.</w:t>
+      </w:r>
+    </w:p>
+    <w:p>
+      <w:pPr/>
+      <w:r>
+        <w:t>Layer 7 — Detective Control (Scapy Passive Sniffer): Phân tích SNI từ TLS ClientHello, HTTP Host header, và DNS query của traffic đã pass Layer 3. Phân loại event thành 4 cấp compliance: ALLOWED (level INFO — domain match explicit whitelist), ALLOWED_BY_IP (level WARNING — IP đã được Layer 3 cho qua nhưng SNI/Host chỉ tới domain KHÔNG có trong whitelist, dấu hiệu CDN shared IP bleed-through), BLOCKED (level BLOCKED — không match cả domain lẫn IP), OBSERVED (passive mode khi thiếu admin).</w:t>
+      </w:r>
+    </w:p>
+    <w:p>
+      <w:pPr/>
+      <w:r>
+        <w:t>Layer 3 — Preventive Control (Windows Firewall): Default Deny outbound trên cả 3 profile (domain/private/public), allow rules theo IP cho whitelist đã resolve, và self-allow rule theo program path (SAINT.exe) cho TCP 443 + UDP/TCP 53. Self-allow rule giúp agent kết nối tới server bất kể IP đích — bền vững với DNS rotation/CDN load balancer. Lớp này chặn ≥99% traffic không cần thiết ở kernel level, hiệu năng tối đa, không bypass được trừ khi có quyền Administrator.</w:t>
+      </w:r>
+    </w:p>
+    <w:p>
+      <w:pPr/>
+      <w:r>
+        <w:t>Hệ thống áp dụng mô hình Defense in Depth với 2 lớp control bổ trợ ở 2 tầng khác nhau, mỗi lớp giải quyết một class of attacks:</w:t>
+      </w:r>
+    </w:p>
+    <w:p>
+      <w:pPr>
+        <w:pStyle w:val="Heading2"/>
+      </w:pPr>
+      <w:r>
+        <w:t>5.4 Defense in Depth — Preventive + Detective</w:t>
       </w:r>
     </w:p>
     <w:p>
@@ -12206,7 +12310,7 @@
           <w:rFonts w:ascii="Arial" w:hAnsi="Arial"/>
           <w:sz w:val="22"/>
         </w:rPr>
-        <w:t>Service-ize bằng systemd hoặc Windows Service.</w:t>
+        <w:t>Service-ize Server bằng systemd (Linux) hoặc NSSM (Windows) để chạy ngầm.</w:t>
       </w:r>
     </w:p>
     <w:p>
@@ -12338,7 +12442,6 @@
           <w:rFonts w:ascii="Arial" w:hAnsi="Arial"/>
           <w:sz w:val="22"/>
         </w:rPr>
-        <w:t>(Tùy chọn) Cài SAINT làm Windows Service để chạy ngầm + tự start cùng OS.</w:t>
       </w:r>
     </w:p>
     <w:p>

</xml_diff>